<commit_message>
imagenes punto reunion, archivos dhl
</commit_message>
<xml_diff>
--- a/Inputs/Templates/MF Banorte.docx
+++ b/Inputs/Templates/MF Banorte.docx
@@ -2162,6 +2162,386 @@
         </w:rPr>
       </w:pPr>
     </w:p>
+    <w:p>
+      <w:pPr>
+        <w:rPr>
+          <w:rFonts w:cstheme="minorHAnsi"/>
+          <w:color w:val="000000" w:themeColor="text1"/>
+        </w:rPr>
+      </w:pPr>
+      <w:r>
+        <w:rPr>
+          <w:rFonts w:cstheme="minorHAnsi"/>
+          <w:color w:val="000000" w:themeColor="text1"/>
+        </w:rPr>
+        <w:br w:type="page"/>
+      </w:r>
+    </w:p>
+    <w:p>
+      <w:pPr>
+        <w:rPr>
+          <w:rFonts w:cstheme="minorHAnsi"/>
+          <w:color w:val="000000" w:themeColor="text1"/>
+        </w:rPr>
+      </w:pPr>
+    </w:p>
+    <w:tbl>
+      <w:tblPr>
+        <w:tblStyle w:val="Tablaconcuadrcula"/>
+        <w:tblW w:w="0" w:type="auto"/>
+        <w:tblBorders>
+          <w:top w:val="none" w:sz="0" w:space="0" w:color="auto"/>
+          <w:left w:val="none" w:sz="0" w:space="0" w:color="auto"/>
+          <w:bottom w:val="none" w:sz="0" w:space="0" w:color="auto"/>
+          <w:right w:val="none" w:sz="0" w:space="0" w:color="auto"/>
+          <w:insideH w:val="none" w:sz="0" w:space="0" w:color="auto"/>
+          <w:insideV w:val="none" w:sz="0" w:space="0" w:color="auto"/>
+        </w:tblBorders>
+        <w:tblLook w:val="04A0" w:firstRow="1" w:lastRow="0" w:firstColumn="1" w:lastColumn="0" w:noHBand="0" w:noVBand="1"/>
+      </w:tblPr>
+      <w:tblGrid>
+        <w:gridCol w:w="4414"/>
+        <w:gridCol w:w="4414"/>
+      </w:tblGrid>
+      <w:tr>
+        <w:trPr>
+          <w:trHeight w:val="3288"/>
+        </w:trPr>
+        <w:tc>
+          <w:tcPr>
+            <w:tcW w:w="4414" w:type="dxa"/>
+            <w:vAlign w:val="center"/>
+          </w:tcPr>
+          <w:p>
+            <w:pPr>
+              <w:pStyle w:val="Prrafodelista"/>
+              <w:spacing w:after="0" w:line="360" w:lineRule="auto"/>
+              <w:ind w:left="0"/>
+              <w:jc w:val="both"/>
+              <w:rPr>
+                <w:rFonts w:cstheme="minorHAnsi"/>
+                <w:color w:val="000000" w:themeColor="text1"/>
+              </w:rPr>
+            </w:pPr>
+            <w:r>
+              <w:rPr>
+                <w:rFonts w:cstheme="minorHAnsi"/>
+                <w:color w:val="000000" w:themeColor="text1"/>
+              </w:rPr>
+              <w:t xml:space="preserve">Cuenta con señales informativas </w:t>
+            </w:r>
+            <w:r>
+              <w:rPr>
+                <w:rFonts w:cstheme="minorHAnsi"/>
+                <w:color w:val="000000" w:themeColor="text1"/>
+              </w:rPr>
+              <w:t xml:space="preserve">de que hacer en caso de sismo e incendio </w:t>
+            </w:r>
+            <w:r>
+              <w:rPr>
+                <w:rFonts w:cstheme="minorHAnsi"/>
+                <w:color w:val="000000" w:themeColor="text1"/>
+              </w:rPr>
+              <w:t xml:space="preserve">con instrucciones claras sobre procedimientos de seguridad en caso de sismo o incendio, se sugiere </w:t>
+            </w:r>
+            <w:r>
+              <w:rPr>
+                <w:rFonts w:cstheme="minorHAnsi"/>
+                <w:color w:val="000000" w:themeColor="text1"/>
+              </w:rPr>
+              <w:t>mantener</w:t>
+            </w:r>
+            <w:r>
+              <w:rPr>
+                <w:rFonts w:cstheme="minorHAnsi"/>
+                <w:color w:val="000000" w:themeColor="text1"/>
+              </w:rPr>
+              <w:t xml:space="preserve"> su correcta ubicación.</w:t>
+            </w:r>
+          </w:p>
+        </w:tc>
+        <w:tc>
+          <w:tcPr>
+            <w:tcW w:w="4414" w:type="dxa"/>
+            <w:vAlign w:val="center"/>
+          </w:tcPr>
+          <w:p>
+            <w:pPr>
+              <w:pStyle w:val="Prrafodelista"/>
+              <w:spacing w:after="0" w:line="360" w:lineRule="auto"/>
+              <w:ind w:left="0"/>
+              <w:jc w:val="center"/>
+              <w:rPr>
+                <w:rFonts w:cstheme="minorHAnsi"/>
+                <w:color w:val="000000" w:themeColor="text1"/>
+              </w:rPr>
+            </w:pPr>
+            <w:proofErr w:type="gramStart"/>
+            <w:r>
+              <w:t xml:space="preserve">{{ </w:t>
+            </w:r>
+            <w:proofErr w:type="spellStart"/>
+            <w:r>
+              <w:t>sis</w:t>
+            </w:r>
+            <w:proofErr w:type="gramEnd"/>
+            <w:r>
+              <w:t>_inc</w:t>
+            </w:r>
+            <w:proofErr w:type="spellEnd"/>
+            <w:r>
+              <w:t xml:space="preserve"> }}</w:t>
+            </w:r>
+          </w:p>
+        </w:tc>
+      </w:tr>
+      <w:tr>
+        <w:trPr>
+          <w:trHeight w:val="20"/>
+        </w:trPr>
+        <w:tc>
+          <w:tcPr>
+            <w:tcW w:w="4414" w:type="dxa"/>
+            <w:vAlign w:val="center"/>
+          </w:tcPr>
+          <w:p>
+            <w:pPr>
+              <w:pStyle w:val="Prrafodelista"/>
+              <w:spacing w:after="0" w:line="240" w:lineRule="auto"/>
+              <w:ind w:left="0"/>
+              <w:jc w:val="both"/>
+              <w:rPr>
+                <w:rFonts w:cstheme="minorHAnsi"/>
+                <w:color w:val="000000" w:themeColor="text1"/>
+                <w:sz w:val="20"/>
+                <w:szCs w:val="20"/>
+              </w:rPr>
+            </w:pPr>
+          </w:p>
+        </w:tc>
+        <w:tc>
+          <w:tcPr>
+            <w:tcW w:w="4414" w:type="dxa"/>
+            <w:vAlign w:val="center"/>
+          </w:tcPr>
+          <w:p>
+            <w:pPr>
+              <w:pStyle w:val="Prrafodelista"/>
+              <w:spacing w:after="0" w:line="240" w:lineRule="auto"/>
+              <w:ind w:left="0"/>
+              <w:jc w:val="center"/>
+              <w:rPr>
+                <w:rFonts w:cstheme="minorHAnsi"/>
+                <w:color w:val="000000" w:themeColor="text1"/>
+              </w:rPr>
+            </w:pPr>
+          </w:p>
+        </w:tc>
+      </w:tr>
+      <w:tr>
+        <w:trPr>
+          <w:trHeight w:val="3288"/>
+        </w:trPr>
+        <w:tc>
+          <w:tcPr>
+            <w:tcW w:w="4414" w:type="dxa"/>
+            <w:vAlign w:val="center"/>
+          </w:tcPr>
+          <w:p>
+            <w:pPr>
+              <w:pStyle w:val="Prrafodelista"/>
+              <w:spacing w:after="0" w:line="360" w:lineRule="auto"/>
+              <w:ind w:left="0"/>
+              <w:jc w:val="both"/>
+              <w:rPr>
+                <w:rFonts w:cstheme="minorHAnsi"/>
+                <w:color w:val="000000" w:themeColor="text1"/>
+              </w:rPr>
+            </w:pPr>
+            <w:r>
+              <w:rPr>
+                <w:rFonts w:cstheme="minorHAnsi"/>
+                <w:noProof/>
+                <w:color w:val="000000" w:themeColor="text1"/>
+                <w:lang w:eastAsia="es-MX"/>
+              </w:rPr>
+              <w:t>C</w:t>
+            </w:r>
+            <w:r>
+              <w:rPr>
+                <w:rFonts w:cstheme="minorHAnsi"/>
+                <w:noProof/>
+                <w:color w:val="000000" w:themeColor="text1"/>
+                <w:lang w:eastAsia="es-MX"/>
+              </w:rPr>
+              <w:t>uenta</w:t>
+            </w:r>
+            <w:r>
+              <w:rPr>
+                <w:rFonts w:cstheme="minorHAnsi"/>
+                <w:color w:val="000000" w:themeColor="text1"/>
+              </w:rPr>
+              <w:t xml:space="preserve"> con </w:t>
+            </w:r>
+            <w:r>
+              <w:rPr>
+                <w:rFonts w:cstheme="minorHAnsi"/>
+                <w:color w:val="000000" w:themeColor="text1"/>
+              </w:rPr>
+              <w:t>señalización</w:t>
+            </w:r>
+            <w:r>
+              <w:rPr>
+                <w:rFonts w:cstheme="minorHAnsi"/>
+                <w:color w:val="000000" w:themeColor="text1"/>
+              </w:rPr>
+              <w:t xml:space="preserve"> de punto de reunión</w:t>
+            </w:r>
+            <w:r>
+              <w:rPr>
+                <w:rFonts w:cstheme="minorHAnsi"/>
+                <w:color w:val="000000" w:themeColor="text1"/>
+              </w:rPr>
+              <w:t xml:space="preserve"> visible que indica un área segura designada para concentrar al personal después de la evacuación en caso de emergencia, se recomienda verificar su accesibilidad y mantener libre de obstáculos de acuerdo con el plan de seguridad establecido.</w:t>
+            </w:r>
+          </w:p>
+        </w:tc>
+        <w:tc>
+          <w:tcPr>
+            <w:tcW w:w="4414" w:type="dxa"/>
+            <w:vAlign w:val="center"/>
+          </w:tcPr>
+          <w:p>
+            <w:pPr>
+              <w:pStyle w:val="Prrafodelista"/>
+              <w:spacing w:after="0" w:line="360" w:lineRule="auto"/>
+              <w:ind w:left="0"/>
+              <w:jc w:val="center"/>
+              <w:rPr>
+                <w:rFonts w:cstheme="minorHAnsi"/>
+                <w:color w:val="000000" w:themeColor="text1"/>
+              </w:rPr>
+            </w:pPr>
+            <w:proofErr w:type="gramStart"/>
+            <w:r>
+              <w:t xml:space="preserve">{{ </w:t>
+            </w:r>
+            <w:proofErr w:type="spellStart"/>
+            <w:r>
+              <w:t>punto</w:t>
+            </w:r>
+            <w:proofErr w:type="gramEnd"/>
+            <w:r>
+              <w:t>_reun</w:t>
+            </w:r>
+            <w:proofErr w:type="spellEnd"/>
+            <w:r>
+              <w:t xml:space="preserve"> }}</w:t>
+            </w:r>
+          </w:p>
+        </w:tc>
+      </w:tr>
+      <w:tr>
+        <w:tc>
+          <w:tcPr>
+            <w:tcW w:w="4414" w:type="dxa"/>
+            <w:vAlign w:val="center"/>
+          </w:tcPr>
+          <w:p>
+            <w:pPr>
+              <w:pStyle w:val="Prrafodelista"/>
+              <w:spacing w:after="0" w:line="240" w:lineRule="auto"/>
+              <w:ind w:left="0"/>
+              <w:jc w:val="both"/>
+              <w:rPr>
+                <w:sz w:val="20"/>
+                <w:szCs w:val="20"/>
+              </w:rPr>
+            </w:pPr>
+          </w:p>
+        </w:tc>
+        <w:tc>
+          <w:tcPr>
+            <w:tcW w:w="4414" w:type="dxa"/>
+            <w:vAlign w:val="center"/>
+          </w:tcPr>
+          <w:p>
+            <w:pPr>
+              <w:pStyle w:val="Prrafodelista"/>
+              <w:spacing w:after="0" w:line="240" w:lineRule="auto"/>
+              <w:ind w:left="0"/>
+              <w:jc w:val="center"/>
+              <w:rPr>
+                <w:sz w:val="20"/>
+                <w:szCs w:val="20"/>
+              </w:rPr>
+            </w:pPr>
+          </w:p>
+        </w:tc>
+      </w:tr>
+      <w:tr>
+        <w:trPr>
+          <w:trHeight w:val="3288"/>
+        </w:trPr>
+        <w:tc>
+          <w:tcPr>
+            <w:tcW w:w="4414" w:type="dxa"/>
+            <w:vAlign w:val="center"/>
+          </w:tcPr>
+          <w:p>
+            <w:pPr>
+              <w:pStyle w:val="Prrafodelista"/>
+              <w:spacing w:after="0" w:line="360" w:lineRule="auto"/>
+              <w:ind w:left="0"/>
+              <w:jc w:val="both"/>
+            </w:pPr>
+            <w:r>
+              <w:t xml:space="preserve">Cuenta con un área específica identificada </w:t>
+            </w:r>
+            <w:r>
+              <w:t xml:space="preserve">como zona de menor riesgo </w:t>
+            </w:r>
+            <w:r>
+              <w:t>para proporcionar resguardo temporal durante eventos peligrosos como sismos, se recomienda asegurar su visibilidad y accesibilidad conforme a los planes de emergencia establecidos.</w:t>
+            </w:r>
+          </w:p>
+        </w:tc>
+        <w:tc>
+          <w:tcPr>
+            <w:tcW w:w="4414" w:type="dxa"/>
+            <w:vAlign w:val="center"/>
+          </w:tcPr>
+          <w:p>
+            <w:pPr>
+              <w:pStyle w:val="Prrafodelista"/>
+              <w:spacing w:after="0" w:line="360" w:lineRule="auto"/>
+              <w:ind w:left="0"/>
+              <w:jc w:val="center"/>
+              <w:rPr>
+                <w:rFonts w:cstheme="minorHAnsi"/>
+                <w:color w:val="000000" w:themeColor="text1"/>
+              </w:rPr>
+            </w:pPr>
+            <w:proofErr w:type="gramStart"/>
+            <w:r>
+              <w:t xml:space="preserve">{{ </w:t>
+            </w:r>
+            <w:proofErr w:type="spellStart"/>
+            <w:r>
+              <w:t>zona</w:t>
+            </w:r>
+            <w:proofErr w:type="gramEnd"/>
+            <w:r>
+              <w:t>_sec</w:t>
+            </w:r>
+            <w:proofErr w:type="spellEnd"/>
+            <w:r>
+              <w:t xml:space="preserve"> }}</w:t>
+            </w:r>
+          </w:p>
+        </w:tc>
+      </w:tr>
+    </w:tbl>
     <w:p>
       <w:pPr>
         <w:rPr>

</xml_diff>